<commit_message>
Update AquiferOpenStudyNotes content for 2026-08-11 release
</commit_message>
<xml_diff>
--- a/fra/docx/24.content.docx
+++ b/fra/docx/24.content.docx
@@ -807,13 +807,13 @@
         <w:rPr>
           <w:lang w:val="fr_FR" w:bidi="fr_FR"/>
         </w:rPr>
-        <w:t>Jérémie craint de paraître ridicule en tant que messager de l'Éternel (voir l'</w:t>
-      </w:r>
-      <w:r>
-        <w:rPr>
-          <w:lang w:val="fr_FR" w:bidi="fr_FR"/>
-        </w:rPr>
-        <w:t>Introduction au livre de Jérémie</w:t>
+        <w:t xml:space="preserve">Jérémie craint de paraître ridicule en tant que messager de l'Éternel (voir </w:t>
+      </w:r>
+      <w:r>
+        <w:rPr>
+          <w:lang w:val="fr_FR" w:bidi="fr_FR"/>
+        </w:rPr>
+        <w:t>l'Introduction au livre de Jérémie</w:t>
       </w:r>
       <w:r>
         <w:rPr>

</xml_diff>